<commit_message>
feat(docker): implement non-root security context and Dockerfile best practices
</commit_message>
<xml_diff>
--- a/cloud-engineering-roadmap/Certifications/CV/RAAFINDRA WAHYU PRATAMA.docx
+++ b/cloud-engineering-roadmap/Certifications/CV/RAAFINDRA WAHYU PRATAMA.docx
@@ -88,7 +88,6 @@
         </w:rPr>
         <w:t>Raafindra.work@gmail.com</w:t>
       </w:r>
-      <w:proofErr w:type="gramStart"/>
       <w:r>
         <w:rPr>
           <w:rFonts w:ascii="Times New Roman" w:eastAsia="Times New Roman" w:hAnsi="Times New Roman" w:cs="Times New Roman"/>
@@ -97,7 +96,6 @@
         </w:rPr>
         <w:t>]</w:t>
       </w:r>
-      <w:proofErr w:type="gramEnd"/>
       <w:r>
         <w:rPr>
           <w:rFonts w:ascii="Times New Roman" w:eastAsia="Times New Roman" w:hAnsi="Times New Roman" w:cs="Times New Roman"/>
@@ -129,8 +127,10 @@
           <w:sz w:val="20"/>
           <w:szCs w:val="20"/>
         </w:rPr>
-        <w:t>https://github.com/raafindra/singapore-cloud-roadmap</w:t>
-      </w:r>
+        <w:t>https://github.com/raafindra</w:t>
+      </w:r>
+      <w:bookmarkStart w:id="0" w:name="_GoBack"/>
+      <w:bookmarkEnd w:id="0"/>
       <w:r>
         <w:rPr>
           <w:rFonts w:ascii="Times New Roman" w:eastAsia="Times New Roman" w:hAnsi="Times New Roman" w:cs="Times New Roman"/>
@@ -2706,17 +2706,7 @@
           <w:sz w:val="20"/>
           <w:szCs w:val="20"/>
         </w:rPr>
-        <w:t xml:space="preserve">Practiced container networking, resource monitoring, persistent storage, and production-oriented </w:t>
-      </w:r>
-      <w:bookmarkStart w:id="0" w:name="_GoBack"/>
-      <w:bookmarkEnd w:id="0"/>
-      <w:r>
-        <w:rPr>
-          <w:rFonts w:ascii="Times New Roman" w:eastAsia="Times New Roman" w:hAnsi="Times New Roman" w:cs="Times New Roman"/>
-          <w:sz w:val="20"/>
-          <w:szCs w:val="20"/>
-        </w:rPr>
-        <w:t xml:space="preserve">troubleshooting scenarios. </w:t>
+        <w:t xml:space="preserve">Practiced container networking, resource monitoring, persistent storage, and production-oriented troubleshooting scenarios. </w:t>
       </w:r>
     </w:p>
     <w:p>

</xml_diff>